<commit_message>
fix: export file, update: can typing in address
</commit_message>
<xml_diff>
--- a/app/templates/hkd/000_HUONG DAN KY + HOP DONG + GIAY DE NGHI.docx
+++ b/app/templates/hkd/000_HUONG DAN KY + HOP DONG + GIAY DE NGHI.docx
@@ -5855,6 +5855,17 @@
         </w:rPr>
         <w:t xml:space="preserve">: </w:t>
       </w:r>
+      <w:r>
+        <w:rPr>
+          <w:rFonts w:ascii="Times New Roman" w:eastAsia="Times New Roman" w:hAnsi="Times New Roman" w:cs="Times New Roman"/>
+          <w:kern w:val="0"/>
+          <w:sz w:val="26"/>
+          <w:szCs w:val="26"/>
+          <w:lang w:val="en"/>
+          <w14:ligatures w14:val="none"/>
+        </w:rPr>
+        <w:t>{{hkd_fax}}</w:t>
+      </w:r>
     </w:p>
     <w:p>
       <w:pPr>
@@ -6060,6 +6071,17 @@
             </w:pict>
           </mc:Fallback>
         </mc:AlternateContent>
+      </w:r>
+      <w:r>
+        <w:rPr>
+          <w:rFonts w:ascii="Times New Roman" w:eastAsia="Times New Roman" w:hAnsi="Times New Roman" w:cs="Times New Roman"/>
+          <w:kern w:val="0"/>
+          <w:sz w:val="26"/>
+          <w:szCs w:val="26"/>
+          <w:lang w:val="en"/>
+          <w14:ligatures w14:val="none"/>
+        </w:rPr>
+        <w:t>{{hkd_web}}</w:t>
       </w:r>
     </w:p>
     <w:p>

</xml_diff>

<commit_message>
add: testcase; update: export JSC
</commit_message>
<xml_diff>
--- a/app/templates/hkd/000_HUONG DAN KY + HOP DONG + GIAY DE NGHI.docx
+++ b/app/templates/hkd/000_HUONG DAN KY + HOP DONG + GIAY DE NGHI.docx
@@ -1093,7 +1093,46 @@
                 <w:lang w:val="pt-BR"/>
                 <w14:ligatures w14:val="none"/>
               </w:rPr>
-              <w:t>Hà Nội, ngày ……tháng …… năm 2026</w:t>
+              <w:t>{{</w:t>
+            </w:r>
+            <w:r>
+              <w:rPr>
+                <w:rFonts w:ascii="Times New Roman" w:eastAsia="Times New Roman" w:hAnsi="Times New Roman" w:cs="Times New Roman"/>
+                <w:i/>
+                <w:iCs/>
+                <w:kern w:val="0"/>
+                <w:sz w:val="26"/>
+                <w:szCs w:val="26"/>
+                <w:lang w:val="pt-BR"/>
+                <w14:ligatures w14:val="none"/>
+              </w:rPr>
+              <w:t>hkd_province</w:t>
+            </w:r>
+            <w:r>
+              <w:rPr>
+                <w:rFonts w:ascii="Times New Roman" w:eastAsia="Times New Roman" w:hAnsi="Times New Roman" w:cs="Times New Roman"/>
+                <w:i/>
+                <w:iCs/>
+                <w:kern w:val="0"/>
+                <w:sz w:val="26"/>
+                <w:szCs w:val="26"/>
+                <w:lang w:val="pt-BR"/>
+                <w14:ligatures w14:val="none"/>
+              </w:rPr>
+              <w:t>}}</w:t>
+            </w:r>
+            <w:r>
+              <w:rPr>
+                <w:rFonts w:ascii="Times New Roman" w:eastAsia="Times New Roman" w:hAnsi="Times New Roman" w:cs="Times New Roman"/>
+                <w:i/>
+                <w:iCs/>
+                <w:kern w:val="0"/>
+                <w:sz w:val="26"/>
+                <w:szCs w:val="26"/>
+                <w:lang w:val="pt-BR"/>
+                <w14:ligatures w14:val="none"/>
+              </w:rPr>
+              <w:t>, ngày ……tháng …… năm 2026</w:t>
             </w:r>
           </w:p>
         </w:tc>
@@ -4071,8 +4110,16 @@
         <w:rPr>
           <w:rFonts w:ascii="Times New Roman" w:eastAsia="Times New Roman" w:hAnsi="Times New Roman" w:cs="Times New Roman"/>
         </w:rPr>
-        <w:t>Đồng ý sử dụng dịch vụ thành lập hộ kinh doanh tại Cenvi Launch;</w:t>
-      </w:r>
+        <w:t xml:space="preserve">Đồng ý sử dụng dịch vụ thành lập hộ kinh doanh tại Cenvi </w:t>
+      </w:r>
+      <w:proofErr w:type="gramStart"/>
+      <w:r>
+        <w:rPr>
+          <w:rFonts w:ascii="Times New Roman" w:eastAsia="Times New Roman" w:hAnsi="Times New Roman" w:cs="Times New Roman"/>
+        </w:rPr>
+        <w:t>Launch;</w:t>
+      </w:r>
+      <w:proofErr w:type="gramEnd"/>
     </w:p>
     <w:p>
       <w:pPr>
@@ -4097,8 +4144,16 @@
         <w:rPr>
           <w:rFonts w:ascii="Times New Roman" w:eastAsia="Times New Roman" w:hAnsi="Times New Roman" w:cs="Times New Roman"/>
         </w:rPr>
-        <w:t>Cam kết cung cấp đầy đủ các giấy tờ và hồ sơ pháp lý cần thiết cho Ngân hàng Techcombank để thực hiện thủ tục mở tài khoản Hộ kinh doanh;</w:t>
-      </w:r>
+        <w:t xml:space="preserve">Cam kết cung cấp đầy đủ các giấy tờ và hồ sơ pháp lý cần thiết cho Ngân hàng Techcombank để thực hiện thủ tục mở tài khoản Hộ kinh </w:t>
+      </w:r>
+      <w:proofErr w:type="gramStart"/>
+      <w:r>
+        <w:rPr>
+          <w:rFonts w:ascii="Times New Roman" w:eastAsia="Times New Roman" w:hAnsi="Times New Roman" w:cs="Times New Roman"/>
+        </w:rPr>
+        <w:t>doanh;</w:t>
+      </w:r>
+      <w:proofErr w:type="gramEnd"/>
     </w:p>
     <w:p>
       <w:pPr>
@@ -4123,8 +4178,16 @@
         <w:rPr>
           <w:rFonts w:ascii="Times New Roman" w:eastAsia="Times New Roman" w:hAnsi="Times New Roman" w:cs="Times New Roman"/>
         </w:rPr>
-        <w:t>Đồng ý cho phép phía Ngân hàng Techcombank sử dụng hồ sơ để mở tài khoản Hộ kinh doanh khoản tại Ngân hàng Techcombank;</w:t>
-      </w:r>
+        <w:t xml:space="preserve">Đồng ý cho phép phía Ngân hàng Techcombank sử dụng hồ sơ để mở tài khoản Hộ kinh doanh khoản tại Ngân hàng </w:t>
+      </w:r>
+      <w:proofErr w:type="gramStart"/>
+      <w:r>
+        <w:rPr>
+          <w:rFonts w:ascii="Times New Roman" w:eastAsia="Times New Roman" w:hAnsi="Times New Roman" w:cs="Times New Roman"/>
+        </w:rPr>
+        <w:t>Techcombank;</w:t>
+      </w:r>
+      <w:proofErr w:type="gramEnd"/>
     </w:p>
     <w:p>
       <w:pPr>
@@ -4142,8 +4205,16 @@
         <w:rPr>
           <w:rFonts w:ascii="Times New Roman" w:eastAsia="Times New Roman" w:hAnsi="Times New Roman" w:cs="Times New Roman"/>
         </w:rPr>
-        <w:t>Đồng ý đăng ký tài khoản Ngân hàng mở tại Techcombank làm tài khoản nộp thuế điện tử của Hộ kinh doanh;</w:t>
-      </w:r>
+        <w:t xml:space="preserve">Đồng ý đăng ký tài khoản Ngân hàng mở tại Techcombank làm tài khoản nộp thuế điện tử của Hộ kinh </w:t>
+      </w:r>
+      <w:proofErr w:type="gramStart"/>
+      <w:r>
+        <w:rPr>
+          <w:rFonts w:ascii="Times New Roman" w:eastAsia="Times New Roman" w:hAnsi="Times New Roman" w:cs="Times New Roman"/>
+        </w:rPr>
+        <w:t>doanh;</w:t>
+      </w:r>
+      <w:proofErr w:type="gramEnd"/>
     </w:p>
     <w:p>
       <w:pPr>
@@ -4168,8 +4239,16 @@
         <w:rPr>
           <w:rFonts w:ascii="Times New Roman" w:eastAsia="Times New Roman" w:hAnsi="Times New Roman" w:cs="Times New Roman"/>
         </w:rPr>
-        <w:t>Cam kết các thông tin và tài liệu cung cấp cho Ngân hàng Techcombank là đầy đủ, hợp pháp, và chính xác;</w:t>
-      </w:r>
+        <w:t xml:space="preserve">Cam kết các thông tin và tài liệu cung cấp cho Ngân hàng Techcombank là đầy đủ, hợp pháp, và chính </w:t>
+      </w:r>
+      <w:proofErr w:type="gramStart"/>
+      <w:r>
+        <w:rPr>
+          <w:rFonts w:ascii="Times New Roman" w:eastAsia="Times New Roman" w:hAnsi="Times New Roman" w:cs="Times New Roman"/>
+        </w:rPr>
+        <w:t>xác;</w:t>
+      </w:r>
+      <w:proofErr w:type="gramEnd"/>
     </w:p>
     <w:p>
       <w:pPr>
@@ -4267,7 +4346,31 @@
                 <w:i/>
                 <w:iCs/>
               </w:rPr>
-              <w:t>Hà Nội, ngày    tháng      năm 2026</w:t>
+              <w:t>{{</w:t>
+            </w:r>
+            <w:r>
+              <w:rPr>
+                <w:rFonts w:ascii="Times New Roman" w:eastAsia="Times New Roman" w:hAnsi="Times New Roman" w:cs="Times New Roman"/>
+                <w:i/>
+                <w:iCs/>
+              </w:rPr>
+              <w:t>hkd_province</w:t>
+            </w:r>
+            <w:r>
+              <w:rPr>
+                <w:rFonts w:ascii="Times New Roman" w:eastAsia="Times New Roman" w:hAnsi="Times New Roman" w:cs="Times New Roman"/>
+                <w:i/>
+                <w:iCs/>
+              </w:rPr>
+              <w:t>}}</w:t>
+            </w:r>
+            <w:r>
+              <w:rPr>
+                <w:rFonts w:ascii="Times New Roman" w:eastAsia="Times New Roman" w:hAnsi="Times New Roman" w:cs="Times New Roman"/>
+                <w:i/>
+                <w:iCs/>
+              </w:rPr>
+              <w:t>, ngày    tháng      năm 2026</w:t>
             </w:r>
           </w:p>
         </w:tc>
@@ -4454,7 +4557,6 @@
           <w:lang w:val="en"/>
           <w14:ligatures w14:val="none"/>
         </w:rPr>
-        <w:lastRenderedPageBreak/>
         <w:t>CỘNG HÒA XÃ HỘI CHỦ NGHĨA VIỆT NAM</w:t>
       </w:r>
     </w:p>
@@ -4584,7 +4686,46 @@
           <w:lang w:val="en"/>
           <w14:ligatures w14:val="none"/>
         </w:rPr>
-        <w:t>Hà Nội, ngày ……tháng …… năm 2026</w:t>
+        <w:t>{{</w:t>
+      </w:r>
+      <w:r>
+        <w:rPr>
+          <w:rFonts w:ascii="Times New Roman" w:eastAsia="Times New Roman" w:hAnsi="Times New Roman" w:cs="Times New Roman"/>
+          <w:i/>
+          <w:iCs/>
+          <w:kern w:val="0"/>
+          <w:sz w:val="26"/>
+          <w:szCs w:val="26"/>
+          <w:lang w:val="en"/>
+          <w14:ligatures w14:val="none"/>
+        </w:rPr>
+        <w:t>hkd_province</w:t>
+      </w:r>
+      <w:r>
+        <w:rPr>
+          <w:rFonts w:ascii="Times New Roman" w:eastAsia="Times New Roman" w:hAnsi="Times New Roman" w:cs="Times New Roman"/>
+          <w:i/>
+          <w:iCs/>
+          <w:kern w:val="0"/>
+          <w:sz w:val="26"/>
+          <w:szCs w:val="26"/>
+          <w:lang w:val="en"/>
+          <w14:ligatures w14:val="none"/>
+        </w:rPr>
+        <w:t>}}</w:t>
+      </w:r>
+      <w:r>
+        <w:rPr>
+          <w:rFonts w:ascii="Times New Roman" w:eastAsia="Times New Roman" w:hAnsi="Times New Roman" w:cs="Times New Roman"/>
+          <w:i/>
+          <w:iCs/>
+          <w:kern w:val="0"/>
+          <w:sz w:val="26"/>
+          <w:szCs w:val="26"/>
+          <w:lang w:val="en"/>
+          <w14:ligatures w14:val="none"/>
+        </w:rPr>
+        <w:t>, ngày ……tháng …… năm 2026</w:t>
       </w:r>
     </w:p>
     <w:p>
@@ -4896,7 +5037,21 @@
           <w:lang w:val="en"/>
           <w14:ligatures w14:val="none"/>
         </w:rPr>
-        <w:t xml:space="preserve"> (nếu có)</w:t>
+        <w:t xml:space="preserve"> (nếu có</w:t>
+      </w:r>
+      <w:proofErr w:type="gramStart"/>
+      <w:r>
+        <w:rPr>
+          <w:rFonts w:ascii="Times New Roman" w:eastAsia="Times New Roman" w:hAnsi="Times New Roman" w:cs="Times New Roman"/>
+          <w:i/>
+          <w:iCs/>
+          <w:kern w:val="0"/>
+          <w:sz w:val="26"/>
+          <w:szCs w:val="26"/>
+          <w:lang w:val="en"/>
+          <w14:ligatures w14:val="none"/>
+        </w:rPr>
+        <w:t>)</w:t>
       </w:r>
       <w:r>
         <w:rPr>
@@ -4918,7 +5073,19 @@
           <w:lang w:val="en"/>
           <w14:ligatures w14:val="none"/>
         </w:rPr>
-        <w:t>{{cus_phone}}</w:t>
+        <w:t>{</w:t>
+      </w:r>
+      <w:proofErr w:type="gramEnd"/>
+      <w:r>
+        <w:rPr>
+          <w:rFonts w:ascii="Times New Roman" w:eastAsia="Times New Roman" w:hAnsi="Times New Roman" w:cs="Times New Roman"/>
+          <w:kern w:val="0"/>
+          <w:sz w:val="26"/>
+          <w:szCs w:val="26"/>
+          <w:lang w:val="en"/>
+          <w14:ligatures w14:val="none"/>
+        </w:rPr>
+        <w:t>{cus_phone}}</w:t>
       </w:r>
     </w:p>
     <w:p>
@@ -4935,6 +5102,7 @@
           <w14:ligatures w14:val="none"/>
         </w:rPr>
       </w:pPr>
+      <w:proofErr w:type="gramStart"/>
       <w:r>
         <w:rPr>
           <w:rFonts w:ascii="Times New Roman" w:eastAsia="Times New Roman" w:hAnsi="Times New Roman" w:cs="Times New Roman"/>
@@ -4979,7 +5147,19 @@
           <w:lang w:val="en"/>
           <w14:ligatures w14:val="none"/>
         </w:rPr>
-        <w:t xml:space="preserve"> {{hkd_email}}</w:t>
+        <w:t xml:space="preserve"> {{</w:t>
+      </w:r>
+      <w:proofErr w:type="gramEnd"/>
+      <w:r>
+        <w:rPr>
+          <w:rFonts w:ascii="Times New Roman" w:eastAsia="Times New Roman" w:hAnsi="Times New Roman" w:cs="Times New Roman"/>
+          <w:kern w:val="0"/>
+          <w:sz w:val="26"/>
+          <w:szCs w:val="26"/>
+          <w:lang w:val="en"/>
+          <w14:ligatures w14:val="none"/>
+        </w:rPr>
+        <w:t>hkd_email}}</w:t>
       </w:r>
     </w:p>
     <w:p>
@@ -5796,6 +5976,7 @@
         </w:rPr>
         <w:t>_phone</w:t>
       </w:r>
+      <w:proofErr w:type="gramStart"/>
       <w:r>
         <w:rPr>
           <w:rFonts w:ascii="Times New Roman" w:eastAsia="Times New Roman" w:hAnsi="Times New Roman" w:cs="Times New Roman"/>
@@ -5818,7 +5999,20 @@
           <w:lang w:val="en"/>
           <w14:ligatures w14:val="none"/>
         </w:rPr>
-        <w:t xml:space="preserve">                               </w:t>
+        <w:t xml:space="preserve">   </w:t>
+      </w:r>
+      <w:proofErr w:type="gramEnd"/>
+      <w:r>
+        <w:rPr>
+          <w:rFonts w:ascii="Times New Roman" w:eastAsia="Times New Roman" w:hAnsi="Times New Roman" w:cs="Times New Roman"/>
+          <w:kern w:val="0"/>
+          <w:sz w:val="26"/>
+          <w:szCs w:val="26"/>
+          <w:highlight w:val="white"/>
+          <w:lang w:val="en"/>
+          <w14:ligatures w14:val="none"/>
+        </w:rPr>
+        <w:t xml:space="preserve">                            </w:t>
       </w:r>
       <w:r>
         <w:rPr>
@@ -5884,6 +6078,7 @@
           <w14:ligatures w14:val="none"/>
         </w:rPr>
       </w:pPr>
+      <w:proofErr w:type="gramStart"/>
       <w:r>
         <w:rPr>
           <w:rFonts w:ascii="Times New Roman" w:eastAsia="Times New Roman" w:hAnsi="Times New Roman" w:cs="Times New Roman"/>
@@ -5928,18 +6123,54 @@
           <w:lang w:val="en"/>
           <w14:ligatures w14:val="none"/>
         </w:rPr>
-        <w:t>{{hkd_email}}</w:t>
-      </w:r>
-      <w:r>
-        <w:rPr>
-          <w:rFonts w:ascii="Times New Roman" w:eastAsia="Times New Roman" w:hAnsi="Times New Roman" w:cs="Times New Roman"/>
-          <w:kern w:val="0"/>
-          <w:sz w:val="26"/>
-          <w:szCs w:val="26"/>
-          <w:lang w:val="en"/>
-          <w14:ligatures w14:val="none"/>
-        </w:rPr>
-        <w:t xml:space="preserve">        </w:t>
+        <w:t>{{</w:t>
+      </w:r>
+      <w:proofErr w:type="gramEnd"/>
+      <w:r>
+        <w:rPr>
+          <w:rFonts w:ascii="Times New Roman" w:eastAsia="Times New Roman" w:hAnsi="Times New Roman" w:cs="Times New Roman"/>
+          <w:kern w:val="0"/>
+          <w:sz w:val="26"/>
+          <w:szCs w:val="26"/>
+          <w:lang w:val="en"/>
+          <w14:ligatures w14:val="none"/>
+        </w:rPr>
+        <w:t>hkd_email</w:t>
+      </w:r>
+      <w:proofErr w:type="gramStart"/>
+      <w:r>
+        <w:rPr>
+          <w:rFonts w:ascii="Times New Roman" w:eastAsia="Times New Roman" w:hAnsi="Times New Roman" w:cs="Times New Roman"/>
+          <w:kern w:val="0"/>
+          <w:sz w:val="26"/>
+          <w:szCs w:val="26"/>
+          <w:lang w:val="en"/>
+          <w14:ligatures w14:val="none"/>
+        </w:rPr>
+        <w:t>}}</w:t>
+      </w:r>
+      <w:r>
+        <w:rPr>
+          <w:rFonts w:ascii="Times New Roman" w:eastAsia="Times New Roman" w:hAnsi="Times New Roman" w:cs="Times New Roman"/>
+          <w:kern w:val="0"/>
+          <w:sz w:val="26"/>
+          <w:szCs w:val="26"/>
+          <w:lang w:val="en"/>
+          <w14:ligatures w14:val="none"/>
+        </w:rPr>
+        <w:t xml:space="preserve">   </w:t>
+      </w:r>
+      <w:proofErr w:type="gramEnd"/>
+      <w:r>
+        <w:rPr>
+          <w:rFonts w:ascii="Times New Roman" w:eastAsia="Times New Roman" w:hAnsi="Times New Roman" w:cs="Times New Roman"/>
+          <w:kern w:val="0"/>
+          <w:sz w:val="26"/>
+          <w:szCs w:val="26"/>
+          <w:lang w:val="en"/>
+          <w14:ligatures w14:val="none"/>
+        </w:rPr>
+        <w:t xml:space="preserve">     </w:t>
       </w:r>
       <w:r>
         <w:rPr>
@@ -6507,7 +6738,20 @@
                 <w:lang w:val="en"/>
                 <w14:ligatures w14:val="none"/>
               </w:rPr>
-              <w:t>{{ind.ten_nganh}}</w:t>
+              <w:t>{{ind.ten_nganh</w:t>
+            </w:r>
+            <w:proofErr w:type="gramStart"/>
+            <w:r>
+              <w:rPr>
+                <w:rFonts w:ascii="Times New Roman" w:eastAsia="Times New Roman" w:hAnsi="Times New Roman" w:cs="Times New Roman"/>
+                <w:kern w:val="0"/>
+                <w:sz w:val="26"/>
+                <w:szCs w:val="26"/>
+                <w:highlight w:val="white"/>
+                <w:lang w:val="en"/>
+                <w14:ligatures w14:val="none"/>
+              </w:rPr>
+              <w:t>}}</w:t>
             </w:r>
             <w:r>
               <w:rPr>
@@ -6518,7 +6762,31 @@
                 <w:lang w:val="en"/>
                 <w14:ligatures w14:val="none"/>
               </w:rPr>
-              <w:t>{% if ind.ghi_chu %}</w:t>
+              <w:t>{</w:t>
+            </w:r>
+            <w:proofErr w:type="gramEnd"/>
+            <w:r>
+              <w:rPr>
+                <w:rFonts w:ascii="Times New Roman" w:eastAsia="Times New Roman" w:hAnsi="Times New Roman" w:cs="Times New Roman"/>
+                <w:kern w:val="0"/>
+                <w:sz w:val="26"/>
+                <w:szCs w:val="26"/>
+                <w:lang w:val="en"/>
+                <w14:ligatures w14:val="none"/>
+              </w:rPr>
+              <w:t xml:space="preserve">% if ind.ghi_chu </w:t>
+            </w:r>
+            <w:proofErr w:type="gramStart"/>
+            <w:r>
+              <w:rPr>
+                <w:rFonts w:ascii="Times New Roman" w:eastAsia="Times New Roman" w:hAnsi="Times New Roman" w:cs="Times New Roman"/>
+                <w:kern w:val="0"/>
+                <w:sz w:val="26"/>
+                <w:szCs w:val="26"/>
+                <w:lang w:val="en"/>
+                <w14:ligatures w14:val="none"/>
+              </w:rPr>
+              <w:t>%}</w:t>
             </w:r>
             <w:r>
               <w:rPr>
@@ -6531,7 +6799,35 @@
                 <w:lang w:val="en"/>
                 <w14:ligatures w14:val="none"/>
               </w:rPr>
-              <w:t>{{ind.ghi_chu}}</w:t>
+              <w:t>{</w:t>
+            </w:r>
+            <w:proofErr w:type="gramEnd"/>
+            <w:r>
+              <w:rPr>
+                <w:rFonts w:ascii="Times New Roman" w:eastAsia="Times New Roman" w:hAnsi="Times New Roman" w:cs="Times New Roman"/>
+                <w:i/>
+                <w:iCs/>
+                <w:kern w:val="0"/>
+                <w:sz w:val="26"/>
+                <w:szCs w:val="26"/>
+                <w:lang w:val="en"/>
+                <w14:ligatures w14:val="none"/>
+              </w:rPr>
+              <w:t>{ind.ghi_chu</w:t>
+            </w:r>
+            <w:proofErr w:type="gramStart"/>
+            <w:r>
+              <w:rPr>
+                <w:rFonts w:ascii="Times New Roman" w:eastAsia="Times New Roman" w:hAnsi="Times New Roman" w:cs="Times New Roman"/>
+                <w:i/>
+                <w:iCs/>
+                <w:kern w:val="0"/>
+                <w:sz w:val="26"/>
+                <w:szCs w:val="26"/>
+                <w:lang w:val="en"/>
+                <w14:ligatures w14:val="none"/>
+              </w:rPr>
+              <w:t>}}</w:t>
             </w:r>
             <w:r>
               <w:rPr>
@@ -6542,7 +6838,19 @@
                 <w:lang w:val="en"/>
                 <w14:ligatures w14:val="none"/>
               </w:rPr>
-              <w:t>{% endif %}</w:t>
+              <w:t>{</w:t>
+            </w:r>
+            <w:proofErr w:type="gramEnd"/>
+            <w:r>
+              <w:rPr>
+                <w:rFonts w:ascii="Times New Roman" w:eastAsia="Times New Roman" w:hAnsi="Times New Roman" w:cs="Times New Roman"/>
+                <w:kern w:val="0"/>
+                <w:sz w:val="26"/>
+                <w:szCs w:val="26"/>
+                <w:lang w:val="en"/>
+                <w14:ligatures w14:val="none"/>
+              </w:rPr>
+              <w:t>% endif %}</w:t>
             </w:r>
           </w:p>
         </w:tc>
@@ -6621,7 +6929,31 @@
                 <w:lang w:val="en"/>
                 <w14:ligatures w14:val="none"/>
               </w:rPr>
-              <w:t>{{ind.chinh}}</w:t>
+              <w:t>{{</w:t>
+            </w:r>
+            <w:proofErr w:type="gramStart"/>
+            <w:r>
+              <w:rPr>
+                <w:rFonts w:ascii="Times New Roman" w:eastAsia="Times New Roman" w:hAnsi="Times New Roman" w:cs="Times New Roman"/>
+                <w:kern w:val="0"/>
+                <w:sz w:val="26"/>
+                <w:szCs w:val="26"/>
+                <w:lang w:val="en"/>
+                <w14:ligatures w14:val="none"/>
+              </w:rPr>
+              <w:t>ind.chinh</w:t>
+            </w:r>
+            <w:proofErr w:type="gramEnd"/>
+            <w:r>
+              <w:rPr>
+                <w:rFonts w:ascii="Times New Roman" w:eastAsia="Times New Roman" w:hAnsi="Times New Roman" w:cs="Times New Roman"/>
+                <w:kern w:val="0"/>
+                <w:sz w:val="26"/>
+                <w:szCs w:val="26"/>
+                <w:lang w:val="en"/>
+                <w14:ligatures w14:val="none"/>
+              </w:rPr>
+              <w:t>}}</w:t>
             </w:r>
           </w:p>
         </w:tc>
@@ -6789,7 +7121,31 @@
           <w:lang w:val="en"/>
           <w14:ligatures w14:val="none"/>
         </w:rPr>
-        <w:t xml:space="preserve">{{hkd_von_so}}    </w:t>
+        <w:t>{{hkd_von_so</w:t>
+      </w:r>
+      <w:proofErr w:type="gramStart"/>
+      <w:r>
+        <w:rPr>
+          <w:rFonts w:ascii="Times New Roman" w:eastAsia="Times New Roman" w:hAnsi="Times New Roman" w:cs="Times New Roman"/>
+          <w:kern w:val="0"/>
+          <w:sz w:val="26"/>
+          <w:szCs w:val="26"/>
+          <w:lang w:val="en"/>
+          <w14:ligatures w14:val="none"/>
+        </w:rPr>
+        <w:t xml:space="preserve">}}   </w:t>
+      </w:r>
+      <w:proofErr w:type="gramEnd"/>
+      <w:r>
+        <w:rPr>
+          <w:rFonts w:ascii="Times New Roman" w:eastAsia="Times New Roman" w:hAnsi="Times New Roman" w:cs="Times New Roman"/>
+          <w:kern w:val="0"/>
+          <w:sz w:val="26"/>
+          <w:szCs w:val="26"/>
+          <w:lang w:val="en"/>
+          <w14:ligatures w14:val="none"/>
+        </w:rPr>
+        <w:t xml:space="preserve"> </w:t>
       </w:r>
       <w:r>
         <w:rPr>
@@ -7135,7 +7491,55 @@
           <w:lang w:val="en"/>
           <w14:ligatures w14:val="none"/>
         </w:rPr>
-        <w:t>: …../…../…….</w:t>
+        <w:t xml:space="preserve">: </w:t>
+      </w:r>
+      <w:proofErr w:type="gramStart"/>
+      <w:r>
+        <w:rPr>
+          <w:rFonts w:ascii="Times New Roman" w:eastAsia="Times New Roman" w:hAnsi="Times New Roman" w:cs="Times New Roman"/>
+          <w:kern w:val="0"/>
+          <w:sz w:val="26"/>
+          <w:szCs w:val="26"/>
+          <w:lang w:val="en"/>
+          <w14:ligatures w14:val="none"/>
+        </w:rPr>
+        <w:t>…..</w:t>
+      </w:r>
+      <w:proofErr w:type="gramEnd"/>
+      <w:r>
+        <w:rPr>
+          <w:rFonts w:ascii="Times New Roman" w:eastAsia="Times New Roman" w:hAnsi="Times New Roman" w:cs="Times New Roman"/>
+          <w:kern w:val="0"/>
+          <w:sz w:val="26"/>
+          <w:szCs w:val="26"/>
+          <w:lang w:val="en"/>
+          <w14:ligatures w14:val="none"/>
+        </w:rPr>
+        <w:t>/</w:t>
+      </w:r>
+      <w:proofErr w:type="gramStart"/>
+      <w:r>
+        <w:rPr>
+          <w:rFonts w:ascii="Times New Roman" w:eastAsia="Times New Roman" w:hAnsi="Times New Roman" w:cs="Times New Roman"/>
+          <w:kern w:val="0"/>
+          <w:sz w:val="26"/>
+          <w:szCs w:val="26"/>
+          <w:lang w:val="en"/>
+          <w14:ligatures w14:val="none"/>
+        </w:rPr>
+        <w:t>…..</w:t>
+      </w:r>
+      <w:proofErr w:type="gramEnd"/>
+      <w:r>
+        <w:rPr>
+          <w:rFonts w:ascii="Times New Roman" w:eastAsia="Times New Roman" w:hAnsi="Times New Roman" w:cs="Times New Roman"/>
+          <w:kern w:val="0"/>
+          <w:sz w:val="26"/>
+          <w:szCs w:val="26"/>
+          <w:lang w:val="en"/>
+          <w14:ligatures w14:val="none"/>
+        </w:rPr>
+        <w:t>/…….</w:t>
       </w:r>
     </w:p>
     <w:p>
@@ -9301,8 +9705,21 @@
           <w:lang w:val="en"/>
           <w14:ligatures w14:val="none"/>
         </w:rPr>
-        <w:t>- Bản thân đồng ý chia sẻ thông tin cá nhân được lưu giữ tại Cơ sở dữ liệu quốc gia về dân cư cho Cơ quan đăng ký kinh doanh cấp xã, Cơ quan quản lý nhà nước về đăng ký kinh doanh để phục vụ công tác quản lý nhà nước về đăng ký hộ kinh doanh theo quy định;</w:t>
-      </w:r>
+        <w:t xml:space="preserve">- Bản thân đồng ý chia sẻ thông tin cá nhân được lưu giữ tại Cơ sở dữ liệu quốc gia về dân cư cho Cơ quan đăng ký kinh doanh cấp xã, Cơ quan quản lý nhà nước về đăng ký kinh doanh để phục vụ công tác quản lý nhà nước về đăng ký hộ kinh doanh theo quy </w:t>
+      </w:r>
+      <w:proofErr w:type="gramStart"/>
+      <w:r>
+        <w:rPr>
+          <w:rFonts w:ascii="Times New Roman" w:eastAsia="Times New Roman" w:hAnsi="Times New Roman" w:cs="Times New Roman"/>
+          <w:kern w:val="0"/>
+          <w:sz w:val="26"/>
+          <w:szCs w:val="26"/>
+          <w:lang w:val="en"/>
+          <w14:ligatures w14:val="none"/>
+        </w:rPr>
+        <w:t>định;</w:t>
+      </w:r>
+      <w:proofErr w:type="gramEnd"/>
     </w:p>
     <w:p>
       <w:pPr>
@@ -9327,8 +9744,21 @@
           <w:lang w:val="en"/>
           <w14:ligatures w14:val="none"/>
         </w:rPr>
-        <w:t>- Bản thân không thuộc diện pháp luật cấm kinh doanh; không đồng thời là chủ hộ kinh doanh, thành viên hộ gia đình đăng ký hộ kinh doanh khác; không là chủ doanh nghiệp tư nhân;</w:t>
-      </w:r>
+        <w:t xml:space="preserve">- Bản thân không thuộc diện pháp luật cấm kinh doanh; không đồng thời là chủ hộ kinh doanh, thành viên hộ gia đình đăng ký hộ kinh doanh khác; không là chủ doanh nghiệp tư </w:t>
+      </w:r>
+      <w:proofErr w:type="gramStart"/>
+      <w:r>
+        <w:rPr>
+          <w:rFonts w:ascii="Times New Roman" w:eastAsia="Times New Roman" w:hAnsi="Times New Roman" w:cs="Times New Roman"/>
+          <w:kern w:val="0"/>
+          <w:sz w:val="26"/>
+          <w:szCs w:val="26"/>
+          <w:lang w:val="en"/>
+          <w14:ligatures w14:val="none"/>
+        </w:rPr>
+        <w:t>nhân;</w:t>
+      </w:r>
+      <w:proofErr w:type="gramEnd"/>
     </w:p>
     <w:p>
       <w:pPr>
@@ -9368,6 +9798,7 @@
         </w:rPr>
         <w:t>hộ kinh doanh chỉ cam kết trong trường hợp kinh doanh tại trụ sở</w:t>
       </w:r>
+      <w:proofErr w:type="gramStart"/>
       <w:r>
         <w:rPr>
           <w:rFonts w:ascii="Times New Roman" w:eastAsia="Times New Roman" w:hAnsi="Times New Roman" w:cs="Times New Roman"/>
@@ -9379,6 +9810,7 @@
         </w:rPr>
         <w:t>);</w:t>
       </w:r>
+      <w:proofErr w:type="gramEnd"/>
     </w:p>
     <w:p>
       <w:pPr>
@@ -13262,7 +13694,6 @@
   <w:style w:type="character" w:default="1" w:styleId="DefaultParagraphFont">
     <w:name w:val="Default Paragraph Font"/>
     <w:uiPriority w:val="1"/>
-    <w:semiHidden/>
     <w:unhideWhenUsed/>
   </w:style>
   <w:style w:type="table" w:default="1" w:styleId="TableNormal">

</xml_diff>